<commit_message>
docs+feat: privacy policy section + v15 §15 (D1-7 + 후처리)
- app/(care)/care/info/page.tsx (D1-7):
  · UserInfoForm 하단에 사진 분석 개인정보 정책 섹션 추가
  · 5건 정책: 서버 미저장 / 즉시 제거 / 재접근 불가 / 로그 미기록 / 결과만 표시
  · chat 진입 전 자연 노출 (사용자가 정보 입력 시 함께 봄)
- docs/planning/닥터홈_프로젝트_인계문서_v15.md:
  · §15 (v15 → v16 전환 사이클) 후처리 추가
  · 15.1 D1 분기 결정 / 15.2 D1 복합 발주 / 15.3 차회 참조
- docs/planning/닥터홈_프로젝트_인계문서_v15.docx:
  · 재생성 22,625 bytes / 214 블록 (v14 변환 스크립트 재사용)

검증: tsc 0 / 기존 보호 24건 hash 1bit 일치 / D1-5 해제 3건 새 baseline /
      G5-3 신규 보호 후보 4건 무변경 / 자가 패치 0건 연속 23회차 달성

Co-Authored-By: Claude Opus 4.7 (1M context) <noreply@anthropic.com>
</commit_message>
<xml_diff>
--- a/docs/planning/닥터홈_프로젝트_인계문서_v15.docx
+++ b/docs/planning/닥터홈_프로젝트_인계문서_v15.docx
@@ -12172,6 +12172,243 @@
           <w:szCs w:val="22"/>
         </w:rPr>
         <w:t xml:space="preserve"> 차회 채팅 진입 시 본 문서 + v14 §15를 첨부 또는 붙여넣고 정책 명시(K-1/K-2/K-3/K-5/O-2/P-1/P-2 + §1.8 + §8.6~8.9)하여 컨텍스트 복구.</w:t>
+      </w:r>
+    </w:p>
+    <w:p>
+      <w:pPr>
+        <w:pBdr>
+          <w:bottom w:val="single" w:color="999999" w:sz="8" w:space="4"/>
+        </w:pBdr>
+        <w:spacing w:after="240" w:before="120"/>
+      </w:pPr>
+    </w:p>
+    <w:p>
+      <w:pPr>
+        <w:pStyle w:val="Heading2"/>
+        <w:spacing w:after="120" w:before="240"/>
+      </w:pPr>
+      <w:r>
+        <w:rPr>
+          <w:rFonts w:ascii="맑은 고딕" w:cs="맑은 고딕" w:eastAsia="맑은 고딕" w:hAnsi="맑은 고딕"/>
+          <w:b/>
+          <w:bCs/>
+          <w:sz w:val="22"/>
+          <w:szCs w:val="22"/>
+        </w:rPr>
+        <w:t xml:space="preserve">15. v15 → v16 전환 사이클 (★ 후처리 추가)</w:t>
+      </w:r>
+    </w:p>
+    <w:p>
+      <w:pPr>
+        <w:pStyle w:val="Heading3"/>
+        <w:spacing w:after="120" w:before="240"/>
+      </w:pPr>
+      <w:r>
+        <w:rPr>
+          <w:rFonts w:ascii="맑은 고딕" w:cs="맑은 고딕" w:eastAsia="맑은 고딕" w:hAnsi="맑은 고딕"/>
+          <w:b/>
+          <w:bCs/>
+          <w:sz w:val="22"/>
+          <w:szCs w:val="22"/>
+        </w:rPr>
+        <w:t xml:space="preserve">15.1 전략적 분기 3회차 — Vision 진단 보조 기능 추가</w:t>
+      </w:r>
+    </w:p>
+    <w:p>
+      <w:pPr>
+        <w:spacing w:after="120"/>
+      </w:pPr>
+      <w:r>
+        <w:rPr>
+          <w:rFonts w:ascii="맑은 고딕" w:cs="맑은 고딕" w:eastAsia="맑은 고딕" w:hAnsi="맑은 고딕"/>
+          <w:sz w:val="22"/>
+          <w:szCs w:val="22"/>
+        </w:rPr>
+        <w:t xml:space="preserve">사용자 결정 (2026-05-24):</w:t>
+      </w:r>
+    </w:p>
+    <w:p>
+      <w:pPr>
+        <w:pStyle w:val="ListParagraph"/>
+        <w:numPr>
+          <w:ilvl w:val="0"/>
+          <w:numId w:val="1"/>
+        </w:numPr>
+        <w:spacing w:after="60"/>
+      </w:pPr>
+      <w:r>
+        <w:rPr>
+          <w:rFonts w:ascii="맑은 고딕" w:cs="맑은 고딕" w:eastAsia="맑은 고딕" w:hAnsi="맑은 고딕"/>
+          <w:sz w:val="22"/>
+          <w:szCs w:val="22"/>
+        </w:rPr>
+        <w:t xml:space="preserve">사진 입력 기능 추가 (피부·외상·눈·목·체표면 종괴·손발톱)</w:t>
+      </w:r>
+    </w:p>
+    <w:p>
+      <w:pPr>
+        <w:pStyle w:val="ListParagraph"/>
+        <w:numPr>
+          <w:ilvl w:val="0"/>
+          <w:numId w:val="1"/>
+        </w:numPr>
+        <w:spacing w:after="60"/>
+      </w:pPr>
+      <w:r>
+        <w:rPr>
+          <w:rFonts w:ascii="맑은 고딕" w:cs="맑은 고딕" w:eastAsia="맑은 고딕" w:hAnsi="맑은 고딕"/>
+          <w:sz w:val="22"/>
+          <w:szCs w:val="22"/>
+        </w:rPr>
+        <w:t xml:space="preserve">"추정 only, 진단 아님, 병원 방문 권고" 톤 규약 신설 (v16 §10.5 신설)</w:t>
+      </w:r>
+    </w:p>
+    <w:p>
+      <w:pPr>
+        <w:pStyle w:val="ListParagraph"/>
+        <w:numPr>
+          <w:ilvl w:val="0"/>
+          <w:numId w:val="1"/>
+        </w:numPr>
+        <w:spacing w:after="60"/>
+      </w:pPr>
+      <w:r>
+        <w:rPr>
+          <w:rFonts w:ascii="맑은 고딕" w:cs="맑은 고딕" w:eastAsia="맑은 고딕" w:hAnsi="맑은 고딕"/>
+          <w:sz w:val="22"/>
+          <w:szCs w:val="22"/>
+        </w:rPr>
+        <w:t xml:space="preserve">사진 서버 미저장 정책 (Blob/KV/DB 일체 사용 금지)</w:t>
+      </w:r>
+    </w:p>
+    <w:p>
+      <w:pPr>
+        <w:pStyle w:val="ListParagraph"/>
+        <w:numPr>
+          <w:ilvl w:val="0"/>
+          <w:numId w:val="1"/>
+        </w:numPr>
+        <w:spacing w:after="60"/>
+      </w:pPr>
+      <w:r>
+        <w:rPr>
+          <w:rFonts w:ascii="맑은 고딕" w:cs="맑은 고딕" w:eastAsia="맑은 고딕" w:hAnsi="맑은 고딕"/>
+          <w:sz w:val="22"/>
+          <w:szCs w:val="22"/>
+        </w:rPr>
+        <w:t xml:space="preserve">사전 조사 생략, 즉시 D1 발주 진입</w:t>
+      </w:r>
+    </w:p>
+    <w:p>
+      <w:pPr>
+        <w:pStyle w:val="Heading3"/>
+        <w:spacing w:after="120" w:before="240"/>
+      </w:pPr>
+      <w:r>
+        <w:rPr>
+          <w:rFonts w:ascii="맑은 고딕" w:cs="맑은 고딕" w:eastAsia="맑은 고딕" w:hAnsi="맑은 고딕"/>
+          <w:b/>
+          <w:bCs/>
+          <w:sz w:val="22"/>
+          <w:szCs w:val="22"/>
+        </w:rPr>
+        <w:t xml:space="preserve">15.2 D1 복합 발주 진행</w:t>
+      </w:r>
+    </w:p>
+    <w:p>
+      <w:pPr>
+        <w:spacing w:after="120"/>
+      </w:pPr>
+      <w:r>
+        <w:rPr>
+          <w:rFonts w:ascii="맑은 고딕" w:cs="맑은 고딕" w:eastAsia="맑은 고딕" w:hAnsi="맑은 고딕"/>
+          <w:sz w:val="22"/>
+          <w:szCs w:val="22"/>
+        </w:rPr>
+        <w:t xml:space="preserve">D1 7모듈 일괄 발주 (G5 584줄 직후 본 프로젝트 최대 단일 발주):</w:t>
+      </w:r>
+    </w:p>
+    <w:p>
+      <w:pPr>
+        <w:pStyle w:val="ListParagraph"/>
+        <w:numPr>
+          <w:ilvl w:val="0"/>
+          <w:numId w:val="1"/>
+        </w:numPr>
+        <w:spacing w:after="60"/>
+      </w:pPr>
+      <w:r>
+        <w:rPr>
+          <w:rFonts w:ascii="맑은 고딕" w:cs="맑은 고딕" w:eastAsia="맑은 고딕" w:hAnsi="맑은 고딕"/>
+          <w:sz w:val="22"/>
+          <w:szCs w:val="22"/>
+        </w:rPr>
+        <w:t xml:space="preserve">D1-1 ~ D1-7</w:t>
+      </w:r>
+    </w:p>
+    <w:p>
+      <w:pPr>
+        <w:pStyle w:val="ListParagraph"/>
+        <w:numPr>
+          <w:ilvl w:val="0"/>
+          <w:numId w:val="1"/>
+        </w:numPr>
+        <w:spacing w:after="60"/>
+      </w:pPr>
+      <w:r>
+        <w:rPr>
+          <w:rFonts w:ascii="맑은 고딕" w:cs="맑은 고딕" w:eastAsia="맑은 고딕" w:hAnsi="맑은 고딕"/>
+          <w:sz w:val="22"/>
+          <w:szCs w:val="22"/>
+        </w:rPr>
+        <w:t xml:space="preserve">4-commit 분할 권장 (G5 단일 commit 트레이드오프 인지 반영)</w:t>
+      </w:r>
+    </w:p>
+    <w:p>
+      <w:pPr>
+        <w:pStyle w:val="ListParagraph"/>
+        <w:numPr>
+          <w:ilvl w:val="0"/>
+          <w:numId w:val="1"/>
+        </w:numPr>
+        <w:spacing w:after="60"/>
+      </w:pPr>
+      <w:r>
+        <w:rPr>
+          <w:rFonts w:ascii="맑은 고딕" w:cs="맑은 고딕" w:eastAsia="맑은 고딕" w:hAnsi="맑은 고딕"/>
+          <w:sz w:val="22"/>
+          <w:szCs w:val="22"/>
+        </w:rPr>
+        <w:t xml:space="preserve">자가 패치 목표: 0건 → 23회차</w:t>
+      </w:r>
+    </w:p>
+    <w:p>
+      <w:pPr>
+        <w:pStyle w:val="Heading3"/>
+        <w:spacing w:after="120" w:before="240"/>
+      </w:pPr>
+      <w:r>
+        <w:rPr>
+          <w:rFonts w:ascii="맑은 고딕" w:cs="맑은 고딕" w:eastAsia="맑은 고딕" w:hAnsi="맑은 고딕"/>
+          <w:b/>
+          <w:bCs/>
+          <w:sz w:val="22"/>
+          <w:szCs w:val="22"/>
+        </w:rPr>
+        <w:t xml:space="preserve">15.3 차회 참조</w:t>
+      </w:r>
+    </w:p>
+    <w:p>
+      <w:pPr>
+        <w:spacing w:after="120"/>
+      </w:pPr>
+      <w:r>
+        <w:rPr>
+          <w:rFonts w:ascii="맑은 고딕" w:cs="맑은 고딕" w:eastAsia="맑은 고딕" w:hAnsi="맑은 고딕"/>
+          <w:sz w:val="22"/>
+          <w:szCs w:val="22"/>
+        </w:rPr>
+        <w:t xml:space="preserve">차회 채팅에서는 본 §15.1~15.3 + v16 인계 문서를 참조.</w:t>
       </w:r>
     </w:p>
     <w:sectPr>

</xml_diff>

<commit_message>
docs+feat: D2 closure — safety post-validation + v15 §15.4
D2 발주문(e75d322) §D2-3·D2-8 정합 보완:

- app/api/checklist/route.ts:
  · LLM 응답 사후 검증 추가 — lib/vision/safety-rules 재사용
  · validateOutput 위반 시 softenOutput으로 단언 어휘 중화
  · cross-module dependency (lib/vision → lib/checklist) 첫 사례
- docs/planning/닥터홈_프로젝트_인계문서_v15.md §15.4 추가:
  · D2 사이클 확정값 + 5-commit 분할 기록
  · checklist closure 후속 작업 명시 (본 commit 포함)
- v15.docx 재생성 (22,625 → 23,245 bytes, 214 → 233 블록)

검증: tsc 0 / 기존 보호 24건 + G5-3 4건 + D1 5건 + D2-7 해제 3건 hash 무변경 /
      자가 패치 0건 연속 27회차 달성

남은 발주문 차이점 2건 (specialties.ts ER / 라우트 깊이) — v17 §C12 인계.

Co-Authored-By: Claude Opus 4.7 (1M context) <noreply@anthropic.com>
</commit_message>
<xml_diff>
--- a/docs/planning/닥터홈_프로젝트_인계문서_v15.docx
+++ b/docs/planning/닥터홈_프로젝트_인계문서_v15.docx
@@ -12408,7 +12408,382 @@
           <w:sz w:val="22"/>
           <w:szCs w:val="22"/>
         </w:rPr>
-        <w:t xml:space="preserve">차회 채팅에서는 본 §15.1~15.3 + v16 인계 문서를 참조.</w:t>
+        <w:t xml:space="preserve">차회 채팅에서는 본 §15.1~15.4 + v16 인계 문서를 참조.</w:t>
+      </w:r>
+    </w:p>
+    <w:p>
+      <w:pPr>
+        <w:pStyle w:val="Heading3"/>
+        <w:spacing w:after="120" w:before="240"/>
+      </w:pPr>
+      <w:r>
+        <w:rPr>
+          <w:rFonts w:ascii="맑은 고딕" w:cs="맑은 고딕" w:eastAsia="맑은 고딕" w:hAnsi="맑은 고딕"/>
+          <w:b/>
+          <w:bCs/>
+          <w:sz w:val="22"/>
+          <w:szCs w:val="22"/>
+        </w:rPr>
+        <w:t xml:space="preserve">15.4 D2 사이클 (체크리스트 방식 도입)</w:t>
+      </w:r>
+    </w:p>
+    <w:p>
+      <w:pPr>
+        <w:spacing w:after="120"/>
+      </w:pPr>
+      <w:r>
+        <w:rPr>
+          <w:rFonts w:ascii="맑은 고딕" w:cs="맑은 고딕" w:eastAsia="맑은 고딕" w:hAnsi="맑은 고딕"/>
+          <w:sz w:val="22"/>
+          <w:szCs w:val="22"/>
+        </w:rPr>
+        <w:t xml:space="preserve">사용자 결정 (2026-05-24): 끈질긴 문진 회피 + 체크리스트 + 즉시 답변 UX.</w:t>
+      </w:r>
+    </w:p>
+    <w:p>
+      <w:pPr>
+        <w:spacing w:after="120"/>
+      </w:pPr>
+      <w:r>
+        <w:rPr>
+          <w:rFonts w:ascii="맑은 고딕" w:cs="맑은 고딕" w:eastAsia="맑은 고딕" w:hAnsi="맑은 고딕"/>
+          <w:sz w:val="22"/>
+          <w:szCs w:val="22"/>
+        </w:rPr>
+        <w:t xml:space="preserve">검토 확정값:</w:t>
+      </w:r>
+    </w:p>
+    <w:p>
+      <w:pPr>
+        <w:pStyle w:val="ListParagraph"/>
+        <w:numPr>
+          <w:ilvl w:val="0"/>
+          <w:numId w:val="1"/>
+        </w:numPr>
+        <w:spacing w:after="60"/>
+      </w:pPr>
+      <w:r>
+        <w:rPr>
+          <w:rFonts w:ascii="맑은 고딕" w:cs="맑은 고딕" w:eastAsia="맑은 고딕" w:hAnsi="맑은 고딕"/>
+          <w:sz w:val="22"/>
+          <w:szCs w:val="22"/>
+        </w:rPr>
+        <w:t xml:space="preserve">대분류 8개 / 일반 증상 113개 / 응급 신호 36개 / 잠정 가능성 88개</w:t>
+      </w:r>
+    </w:p>
+    <w:p>
+      <w:pPr>
+        <w:pStyle w:val="ListParagraph"/>
+        <w:numPr>
+          <w:ilvl w:val="0"/>
+          <w:numId w:val="1"/>
+        </w:numPr>
+        <w:spacing w:after="60"/>
+      </w:pPr>
+      <w:r>
+        <w:rPr>
+          <w:rFonts w:ascii="맑은 고딕" w:cs="맑은 고딕" w:eastAsia="맑은 고딕" w:hAnsi="맑은 고딕"/>
+          <w:sz w:val="22"/>
+          <w:szCs w:val="22"/>
+        </w:rPr>
+        <w:t xml:space="preserve">자살 충동 (#30) 특별 분기 — 1393 자동 표시</w:t>
+      </w:r>
+    </w:p>
+    <w:p>
+      <w:pPr>
+        <w:pStyle w:val="ListParagraph"/>
+        <w:numPr>
+          <w:ilvl w:val="0"/>
+          <w:numId w:val="1"/>
+        </w:numPr>
+        <w:spacing w:after="60"/>
+      </w:pPr>
+      <w:r>
+        <w:rPr>
+          <w:rFonts w:ascii="맑은 고딕" w:cs="맑은 고딕" w:eastAsia="맑은 고딕" w:hAnsi="맑은 고딕"/>
+          <w:sz w:val="22"/>
+          <w:szCs w:val="22"/>
+        </w:rPr>
+        <w:t xml:space="preserve">보호자 토글 (본인/가족/어린이/노인)</w:t>
+      </w:r>
+    </w:p>
+    <w:p>
+      <w:pPr>
+        <w:pStyle w:val="ListParagraph"/>
+        <w:numPr>
+          <w:ilvl w:val="0"/>
+          <w:numId w:val="1"/>
+        </w:numPr>
+        <w:spacing w:after="60"/>
+      </w:pPr>
+      <w:r>
+        <w:rPr>
+          <w:rFonts w:ascii="맑은 고딕" w:cs="맑은 고딕" w:eastAsia="맑은 고딕" w:hAnsi="맑은 고딕"/>
+          <w:sz w:val="22"/>
+          <w:szCs w:val="22"/>
+        </w:rPr>
+        <w:t xml:space="preserve">면책 6 → 7건 확장</w:t>
+      </w:r>
+    </w:p>
+    <w:p>
+      <w:pPr>
+        <w:pStyle w:val="ListParagraph"/>
+        <w:numPr>
+          <w:ilvl w:val="0"/>
+          <w:numId w:val="1"/>
+        </w:numPr>
+        <w:spacing w:after="60"/>
+      </w:pPr>
+      <w:r>
+        <w:rPr>
+          <w:rFonts w:ascii="맑은 고딕" w:cs="맑은 고딕" w:eastAsia="맑은 고딕" w:hAnsi="맑은 고딕"/>
+          <w:sz w:val="22"/>
+          <w:szCs w:val="22"/>
+        </w:rPr>
+        <w:t xml:space="preserve">Decision Rules 3단 계층 (응급 → 조합 → 일반)</w:t>
+      </w:r>
+    </w:p>
+    <w:p>
+      <w:pPr>
+        <w:pStyle w:val="ListParagraph"/>
+        <w:numPr>
+          <w:ilvl w:val="0"/>
+          <w:numId w:val="1"/>
+        </w:numPr>
+        <w:spacing w:after="60"/>
+      </w:pPr>
+      <w:r>
+        <w:rPr>
+          <w:rFonts w:ascii="맑은 고딕" w:cs="맑은 고딕" w:eastAsia="맑은 고딕" w:hAnsi="맑은 고딕"/>
+          <w:sz w:val="22"/>
+          <w:szCs w:val="22"/>
+        </w:rPr>
+        <w:t xml:space="preserve">UX 4단계 / 약 1분 입력</w:t>
+      </w:r>
+    </w:p>
+    <w:p>
+      <w:pPr>
+        <w:pStyle w:val="ListParagraph"/>
+        <w:numPr>
+          <w:ilvl w:val="0"/>
+          <w:numId w:val="1"/>
+        </w:numPr>
+        <w:spacing w:after="60"/>
+      </w:pPr>
+      <w:r>
+        <w:rPr>
+          <w:rFonts w:ascii="맑은 고딕" w:cs="맑은 고딕" w:eastAsia="맑은 고딕" w:hAnsi="맑은 고딕"/>
+          <w:sz w:val="22"/>
+          <w:szCs w:val="22"/>
+        </w:rPr>
+        <w:t xml:space="preserve">D1 Vision 결합: 피부·외상 카테고리만 사진 노출</w:t>
+      </w:r>
+    </w:p>
+    <w:p>
+      <w:pPr>
+        <w:spacing w:after="120"/>
+      </w:pPr>
+      <w:r>
+        <w:rPr>
+          <w:rFonts w:ascii="맑은 고딕" w:cs="맑은 고딕" w:eastAsia="맑은 고딕" w:hAnsi="맑은 고딕"/>
+          <w:sz w:val="22"/>
+          <w:szCs w:val="22"/>
+        </w:rPr>
+        <w:t xml:space="preserve">D2 8모듈 일괄 발주 (본 프로젝트 최대 단일 발주, ~1,455 라인):</w:t>
+      </w:r>
+    </w:p>
+    <w:p>
+      <w:pPr>
+        <w:pStyle w:val="ListParagraph"/>
+        <w:numPr>
+          <w:ilvl w:val="0"/>
+          <w:numId w:val="1"/>
+        </w:numPr>
+        <w:spacing w:after="60"/>
+      </w:pPr>
+      <w:r>
+        <w:rPr>
+          <w:rFonts w:ascii="맑은 고딕" w:cs="맑은 고딕" w:eastAsia="맑은 고딕" w:hAnsi="맑은 고딕"/>
+          <w:sz w:val="22"/>
+          <w:szCs w:val="22"/>
+        </w:rPr>
+        <w:t xml:space="preserve">D2-1 ~ D2-7 + D2-8 (§15 후처리)</w:t>
+      </w:r>
+    </w:p>
+    <w:p>
+      <w:pPr>
+        <w:pStyle w:val="ListParagraph"/>
+        <w:numPr>
+          <w:ilvl w:val="0"/>
+          <w:numId w:val="1"/>
+        </w:numPr>
+        <w:spacing w:after="60"/>
+      </w:pPr>
+      <w:r>
+        <w:rPr>
+          <w:rFonts w:ascii="맑은 고딕" w:cs="맑은 고딕" w:eastAsia="맑은 고딕" w:hAnsi="맑은 고딕"/>
+          <w:sz w:val="22"/>
+          <w:szCs w:val="22"/>
+        </w:rPr>
+        <w:t xml:space="preserve">5-commit 분할 (commits </w:t>
+      </w:r>
+      <w:r>
+        <w:rPr>
+          <w:rFonts w:ascii="Consolas" w:cs="Consolas" w:eastAsia="Consolas" w:hAnsi="Consolas"/>
+          <w:sz w:val="20"/>
+          <w:szCs w:val="20"/>
+          <w:shd w:fill="F2F2F2" w:val="clear"/>
+        </w:rPr>
+        <w:t xml:space="preserve">6e95f2c</w:t>
+      </w:r>
+      <w:r>
+        <w:rPr>
+          <w:rFonts w:ascii="맑은 고딕" w:cs="맑은 고딕" w:eastAsia="맑은 고딕" w:hAnsi="맑은 고딕"/>
+          <w:sz w:val="22"/>
+          <w:szCs w:val="22"/>
+        </w:rPr>
+        <w:t xml:space="preserve"> ~ </w:t>
+      </w:r>
+      <w:r>
+        <w:rPr>
+          <w:rFonts w:ascii="Consolas" w:cs="Consolas" w:eastAsia="Consolas" w:hAnsi="Consolas"/>
+          <w:sz w:val="20"/>
+          <w:szCs w:val="20"/>
+          <w:shd w:fill="F2F2F2" w:val="clear"/>
+        </w:rPr>
+        <w:t xml:space="preserve">da7382c</w:t>
+      </w:r>
+      <w:r>
+        <w:rPr>
+          <w:rFonts w:ascii="맑은 고딕" w:cs="맑은 고딕" w:eastAsia="맑은 고딕" w:hAnsi="맑은 고딕"/>
+          <w:sz w:val="22"/>
+          <w:szCs w:val="22"/>
+        </w:rPr>
+        <w:t xml:space="preserve">)</w:t>
+      </w:r>
+    </w:p>
+    <w:p>
+      <w:pPr>
+        <w:pStyle w:val="ListParagraph"/>
+        <w:numPr>
+          <w:ilvl w:val="0"/>
+          <w:numId w:val="1"/>
+        </w:numPr>
+        <w:spacing w:after="60"/>
+      </w:pPr>
+      <w:r>
+        <w:rPr>
+          <w:rFonts w:ascii="맑은 고딕" w:cs="맑은 고딕" w:eastAsia="맑은 고딕" w:hAnsi="맑은 고딕"/>
+          <w:sz w:val="22"/>
+          <w:szCs w:val="22"/>
+        </w:rPr>
+        <w:t xml:space="preserve">발주문 commit </w:t>
+      </w:r>
+      <w:r>
+        <w:rPr>
+          <w:rFonts w:ascii="Consolas" w:cs="Consolas" w:eastAsia="Consolas" w:hAnsi="Consolas"/>
+          <w:sz w:val="20"/>
+          <w:szCs w:val="20"/>
+          <w:shd w:fill="F2F2F2" w:val="clear"/>
+        </w:rPr>
+        <w:t xml:space="preserve">e75d322</w:t>
+      </w:r>
+    </w:p>
+    <w:p>
+      <w:pPr>
+        <w:spacing w:after="120"/>
+      </w:pPr>
+      <w:r>
+        <w:rPr>
+          <w:rFonts w:ascii="맑은 고딕" w:cs="맑은 고딕" w:eastAsia="맑은 고딕" w:hAnsi="맑은 고딕"/>
+          <w:sz w:val="22"/>
+          <w:szCs w:val="22"/>
+        </w:rPr>
+        <w:t xml:space="preserve">D2 closure (2026-05-24 후속):</w:t>
+      </w:r>
+    </w:p>
+    <w:p>
+      <w:pPr>
+        <w:pStyle w:val="ListParagraph"/>
+        <w:numPr>
+          <w:ilvl w:val="0"/>
+          <w:numId w:val="1"/>
+        </w:numPr>
+        <w:spacing w:after="60"/>
+      </w:pPr>
+      <w:r>
+        <w:rPr>
+          <w:rFonts w:ascii="맑은 고딕" w:cs="맑은 고딕" w:eastAsia="맑은 고딕" w:hAnsi="맑은 고딕"/>
+          <w:sz w:val="22"/>
+          <w:szCs w:val="22"/>
+        </w:rPr>
+        <w:t xml:space="preserve">checklist API에 </w:t>
+      </w:r>
+      <w:r>
+        <w:rPr>
+          <w:rFonts w:ascii="Consolas" w:cs="Consolas" w:eastAsia="Consolas" w:hAnsi="Consolas"/>
+          <w:sz w:val="20"/>
+          <w:szCs w:val="20"/>
+          <w:shd w:fill="F2F2F2" w:val="clear"/>
+        </w:rPr>
+        <w:t xml:space="preserve">lib/vision/safety-rules</w:t>
+      </w:r>
+      <w:r>
+        <w:rPr>
+          <w:rFonts w:ascii="맑은 고딕" w:cs="맑은 고딕" w:eastAsia="맑은 고딕" w:hAnsi="맑은 고딕"/>
+          <w:sz w:val="22"/>
+          <w:szCs w:val="22"/>
+        </w:rPr>
+        <w:t xml:space="preserve"> validateOutput + softenOutput 사후 검증 추가</w:t>
+      </w:r>
+    </w:p>
+    <w:p>
+      <w:pPr>
+        <w:pStyle w:val="ListParagraph"/>
+        <w:numPr>
+          <w:ilvl w:val="0"/>
+          <w:numId w:val="1"/>
+        </w:numPr>
+        <w:spacing w:after="60"/>
+      </w:pPr>
+      <w:r>
+        <w:rPr>
+          <w:rFonts w:ascii="맑은 고딕" w:cs="맑은 고딕" w:eastAsia="맑은 고딕" w:hAnsi="맑은 고딕"/>
+          <w:sz w:val="22"/>
+          <w:szCs w:val="22"/>
+        </w:rPr>
+        <w:t xml:space="preserve">본 §15.4 추가 + v15.docx 재생성</w:t>
+      </w:r>
+    </w:p>
+    <w:p>
+      <w:pPr>
+        <w:pStyle w:val="ListParagraph"/>
+        <w:numPr>
+          <w:ilvl w:val="0"/>
+          <w:numId w:val="1"/>
+        </w:numPr>
+        <w:spacing w:after="60"/>
+      </w:pPr>
+      <w:r>
+        <w:rPr>
+          <w:rFonts w:ascii="맑은 고딕" w:cs="맑은 고딕" w:eastAsia="맑은 고딕" w:hAnsi="맑은 고딕"/>
+          <w:sz w:val="22"/>
+          <w:szCs w:val="22"/>
+        </w:rPr>
+        <w:t xml:space="preserve">자가 패치 0건 연속 26회차</w:t>
+      </w:r>
+    </w:p>
+    <w:p>
+      <w:pPr>
+        <w:spacing w:after="120"/>
+      </w:pPr>
+      <w:r>
+        <w:rPr>
+          <w:rFonts w:ascii="맑은 고딕" w:cs="맑은 고딕" w:eastAsia="맑은 고딕" w:hAnsi="맑은 고딕"/>
+          <w:sz w:val="22"/>
+          <w:szCs w:val="22"/>
+        </w:rPr>
+        <w:t xml:space="preserve">차후 v16 인계 문서에서 본 §15.4를 §1.1 참조용으로 사용.</w:t>
       </w:r>
     </w:p>
     <w:sectPr>

</xml_diff>